<commit_message>
update tarahi narmafzar ta akhar fasle 4
</commit_message>
<xml_diff>
--- a/مهندسی نرمافزار/پروژه.docx
+++ b/مهندسی نرمافزار/پروژه.docx
@@ -1492,7 +1492,6 @@
               <w:bidi/>
               <w:jc w:val="left"/>
               <w:rPr>
-                <w:rFonts w:hint="cs"/>
                 <w:rtl/>
                 <w:lang w:bidi="fa-IR"/>
               </w:rPr>
@@ -1516,7 +1515,6 @@
               <w:bidi/>
               <w:jc w:val="left"/>
               <w:rPr>
-                <w:rFonts w:hint="cs"/>
                 <w:rtl/>
                 <w:lang w:bidi="fa-IR"/>
               </w:rPr>
@@ -1540,7 +1538,6 @@
               <w:bidi/>
               <w:jc w:val="left"/>
               <w:rPr>
-                <w:rFonts w:hint="cs"/>
                 <w:rtl/>
                 <w:lang w:bidi="fa-IR"/>
               </w:rPr>
@@ -1564,7 +1561,6 @@
               <w:bidi/>
               <w:jc w:val="left"/>
               <w:rPr>
-                <w:rFonts w:hint="cs"/>
                 <w:rtl/>
                 <w:lang w:bidi="fa-IR"/>
               </w:rPr>
@@ -1588,7 +1584,6 @@
               <w:bidi/>
               <w:jc w:val="left"/>
               <w:rPr>
-                <w:rFonts w:hint="cs"/>
                 <w:rtl/>
                 <w:lang w:bidi="fa-IR"/>
               </w:rPr>
@@ -1612,7 +1607,6 @@
               <w:bidi/>
               <w:jc w:val="left"/>
               <w:rPr>
-                <w:rFonts w:hint="cs"/>
                 <w:rtl/>
                 <w:lang w:bidi="fa-IR"/>
               </w:rPr>
@@ -1636,7 +1630,6 @@
               <w:bidi/>
               <w:jc w:val="left"/>
               <w:rPr>
-                <w:rFonts w:hint="cs"/>
                 <w:rtl/>
                 <w:lang w:bidi="fa-IR"/>
               </w:rPr>
@@ -1982,78 +1975,7 @@
     <w:p>
       <w:pPr>
         <w:bidi/>
-        <w:jc w:val="left"/>
-        <w:rPr>
-          <w:rtl/>
-          <w:lang w:bidi="fa-IR"/>
-        </w:rPr>
-      </w:pPr>
-    </w:p>
-    <w:p>
-      <w:pPr>
-        <w:bidi/>
-        <w:rPr>
-          <w:rtl/>
-          <w:lang w:bidi="fa-IR"/>
-        </w:rPr>
-      </w:pPr>
-    </w:p>
-    <w:p>
-      <w:pPr>
-        <w:bidi/>
-        <w:rPr>
-          <w:rtl/>
-          <w:lang w:bidi="fa-IR"/>
-        </w:rPr>
-      </w:pPr>
-    </w:p>
-    <w:p>
-      <w:pPr>
-        <w:bidi/>
-        <w:rPr>
-          <w:rtl/>
-          <w:lang w:bidi="fa-IR"/>
-        </w:rPr>
-      </w:pPr>
-    </w:p>
-    <w:p>
-      <w:pPr>
-        <w:bidi/>
-        <w:rPr>
-          <w:rtl/>
-          <w:lang w:bidi="fa-IR"/>
-        </w:rPr>
-      </w:pPr>
-    </w:p>
-    <w:p>
-      <w:pPr>
-        <w:bidi/>
-        <w:rPr>
-          <w:rtl/>
-          <w:lang w:bidi="fa-IR"/>
-        </w:rPr>
-      </w:pPr>
-    </w:p>
-    <w:p>
-      <w:pPr>
-        <w:jc w:val="left"/>
-        <w:rPr>
-          <w:rtl/>
-          <w:lang w:bidi="fa-IR"/>
-        </w:rPr>
-      </w:pPr>
-      <w:r>
-        <w:rPr>
-          <w:rtl/>
-          <w:lang w:bidi="fa-IR"/>
-        </w:rPr>
-        <w:br w:type="page"/>
-      </w:r>
-    </w:p>
-    <w:p>
-      <w:pPr>
-        <w:bidi/>
-        <w:jc w:val="left"/>
+        <w:jc w:val="both"/>
         <w:rPr>
           <w:rtl/>
           <w:lang w:bidi="fa-IR"/>
@@ -2065,7 +1987,124 @@
           <w:rtl/>
           <w:lang w:bidi="fa-IR"/>
         </w:rPr>
-        <w:lastRenderedPageBreak/>
+        <w:t>ریشه یابی خطاها:‌</w:t>
+      </w:r>
+    </w:p>
+    <w:p>
+      <w:pPr>
+        <w:bidi/>
+        <w:jc w:val="both"/>
+        <w:rPr>
+          <w:rtl/>
+          <w:lang w:bidi="fa-IR"/>
+        </w:rPr>
+      </w:pPr>
+      <w:r>
+        <w:rPr>
+          <w:rFonts w:hint="cs"/>
+          <w:rtl/>
+          <w:lang w:bidi="fa-IR"/>
+        </w:rPr>
+        <w:t>همانطور که در جدل بالا مشاده میکنیم بیشترین خطا ها برای سه بخش:‌ اتصال برنامه به دیتا بیس و ساخت دیتاست مورد نیاز و همچنین در اتصالا سیستم عصبی به دوربین بوده است. از خطا های زیاد در این قسمت ها میتوان فهمید که تیم توسعه تجربه کافی برای پروژه رو ندارند و این موضوع در پروژه های دانشبنیان، عادی طلقی میشود. برای جبران این خلع ایجاد شده میتوان از راهکار های زیر استفاده کرد:</w:t>
+      </w:r>
+    </w:p>
+    <w:p>
+      <w:pPr>
+        <w:pStyle w:val="ListParagraph"/>
+        <w:numPr>
+          <w:ilvl w:val="0"/>
+          <w:numId w:val="6"/>
+        </w:numPr>
+        <w:bidi/>
+        <w:jc w:val="both"/>
+        <w:rPr>
+          <w:rFonts w:ascii="Calibri" w:hAnsi="Calibri" w:cs="Calibri"/>
+          <w:lang w:bidi="fa-IR"/>
+        </w:rPr>
+      </w:pPr>
+      <w:r>
+        <w:rPr>
+          <w:rFonts w:ascii="Calibri" w:hAnsi="Calibri" w:cs="Calibri" w:hint="cs"/>
+          <w:rtl/>
+          <w:lang w:bidi="fa-IR"/>
+        </w:rPr>
+        <w:t>مشکل خطا در اتصال برنامه به دیتابیس:‌ استفاده از یک فرد با تجربه بیشتر بعنوان مشاور که در کنار تیم قرار دارد و مشکلات تیم رو در این مسئله رفع میکند.</w:t>
+      </w:r>
+    </w:p>
+    <w:p>
+      <w:pPr>
+        <w:pStyle w:val="ListParagraph"/>
+        <w:numPr>
+          <w:ilvl w:val="0"/>
+          <w:numId w:val="6"/>
+        </w:numPr>
+        <w:bidi/>
+        <w:jc w:val="both"/>
+        <w:rPr>
+          <w:rFonts w:ascii="Calibri" w:hAnsi="Calibri" w:cs="Calibri"/>
+          <w:lang w:bidi="fa-IR"/>
+        </w:rPr>
+      </w:pPr>
+      <w:r>
+        <w:rPr>
+          <w:rFonts w:ascii="Calibri" w:hAnsi="Calibri" w:cs="Calibri" w:hint="cs"/>
+          <w:rtl/>
+          <w:lang w:bidi="fa-IR"/>
+        </w:rPr>
+        <w:t>مشکل ساخت دیتاست: برای این مشکل میتوان از دیتاست هایی که از قبل برای سیستم های تشخیص چهره طراحی شده، استفاده کرد. این کار هم باعث صرفه جویی در وقت و هم بهبود چشم گیر دقت سیستم میشود.</w:t>
+      </w:r>
+    </w:p>
+    <w:p>
+      <w:pPr>
+        <w:pStyle w:val="ListParagraph"/>
+        <w:numPr>
+          <w:ilvl w:val="0"/>
+          <w:numId w:val="6"/>
+        </w:numPr>
+        <w:bidi/>
+        <w:jc w:val="both"/>
+        <w:rPr>
+          <w:rFonts w:ascii="Calibri" w:hAnsi="Calibri" w:cs="Calibri"/>
+          <w:lang w:bidi="fa-IR"/>
+        </w:rPr>
+      </w:pPr>
+      <w:r>
+        <w:rPr>
+          <w:rFonts w:ascii="Calibri" w:hAnsi="Calibri" w:cs="Calibri" w:hint="cs"/>
+          <w:rtl/>
+          <w:lang w:bidi="fa-IR"/>
+        </w:rPr>
+        <w:t>مشکل اتصال شبکه عصبی به دوربین:‌ این مسئله از دو زاویه باید بررسی شود. یک تیم برنامه نویسی، دو تیم سخت افزار. برای رفع این مشکل باز هم نیاز به فردی با تجربه بالا هست.</w:t>
+      </w:r>
+    </w:p>
+    <w:p>
+      <w:pPr>
+        <w:bidi/>
+        <w:ind w:left="360"/>
+        <w:jc w:val="both"/>
+        <w:rPr>
+          <w:rFonts w:ascii="Calibri" w:hAnsi="Calibri" w:cs="Calibri"/>
+          <w:lang w:bidi="fa-IR"/>
+        </w:rPr>
+      </w:pPr>
+    </w:p>
+    <w:p>
+      <w:pPr>
+        <w:bidi/>
+        <w:ind w:left="360"/>
+        <w:jc w:val="both"/>
+        <w:rPr>
+          <w:rFonts w:ascii="Calibri" w:hAnsi="Calibri" w:cs="Calibri"/>
+          <w:rtl/>
+          <w:lang w:bidi="fa-IR"/>
+        </w:rPr>
+      </w:pPr>
+      <w:r>
+        <w:rPr>
+          <w:rFonts w:hint="cs"/>
+          <w:rtl/>
+          <w:lang w:bidi="fa-IR"/>
+        </w:rPr>
         <w:t>نمودار استخوان ماهی برای سیستم تشخیص چهره آسانسور هوشمند</w:t>
       </w:r>
     </w:p>
@@ -2099,7 +2138,7 @@
                     <pic:cNvPicPr/>
                   </pic:nvPicPr>
                   <pic:blipFill>
-                    <a:blip r:embed="rId5">
+                    <a:blip r:embed="rId6">
                       <a:extLst>
                         <a:ext uri="{28A0092B-C50C-407E-A947-70E740481C1C}">
                           <a14:useLocalDpi xmlns:a14="http://schemas.microsoft.com/office/drawing/2010/main" val="0"/>
@@ -2347,7 +2386,6 @@
               <w:bidi/>
               <w:jc w:val="left"/>
               <w:rPr>
-                <w:rFonts w:hint="cs"/>
                 <w:rtl/>
                 <w:lang w:bidi="fa-IR"/>
               </w:rPr>
@@ -2446,7 +2484,6 @@
               <w:bidi/>
               <w:jc w:val="left"/>
               <w:rPr>
-                <w:rFonts w:hint="cs"/>
                 <w:rtl/>
                 <w:lang w:bidi="fa-IR"/>
               </w:rPr>
@@ -2922,7 +2959,6 @@
               <w:bidi/>
               <w:jc w:val="left"/>
               <w:rPr>
-                <w:rFonts w:hint="cs"/>
                 <w:rtl/>
                 <w:lang w:bidi="fa-IR"/>
               </w:rPr>
@@ -3037,7 +3073,6 @@
               <w:bidi/>
               <w:jc w:val="left"/>
               <w:rPr>
-                <w:rFonts w:hint="cs"/>
                 <w:rtl/>
                 <w:lang w:bidi="fa-IR"/>
               </w:rPr>
@@ -3151,7 +3186,6 @@
               <w:bidi/>
               <w:jc w:val="left"/>
               <w:rPr>
-                <w:rFonts w:hint="cs"/>
                 <w:rtl/>
                 <w:lang w:bidi="fa-IR"/>
               </w:rPr>
@@ -3265,7 +3299,6 @@
               <w:bidi/>
               <w:jc w:val="left"/>
               <w:rPr>
-                <w:rFonts w:hint="cs"/>
                 <w:rtl/>
                 <w:lang w:bidi="fa-IR"/>
               </w:rPr>
@@ -3419,9 +3452,431 @@
       <w:pPr>
         <w:bidi/>
         <w:rPr>
-          <w:lang w:bidi="fa-IR"/>
-        </w:rPr>
-      </w:pPr>
+          <w:rtl/>
+          <w:lang w:bidi="fa-IR"/>
+        </w:rPr>
+      </w:pPr>
+    </w:p>
+    <w:p>
+      <w:pPr>
+        <w:jc w:val="left"/>
+        <w:rPr>
+          <w:rtl/>
+          <w:lang w:bidi="fa-IR"/>
+        </w:rPr>
+      </w:pPr>
+      <w:r>
+        <w:rPr>
+          <w:rtl/>
+          <w:lang w:bidi="fa-IR"/>
+        </w:rPr>
+        <w:br w:type="page"/>
+      </w:r>
+    </w:p>
+    <w:p>
+      <w:pPr>
+        <w:bidi/>
+        <w:jc w:val="left"/>
+        <w:rPr>
+          <w:rtl/>
+          <w:lang w:bidi="fa-IR"/>
+        </w:rPr>
+      </w:pPr>
+      <w:r>
+        <w:rPr>
+          <w:rFonts w:hint="cs"/>
+          <w:rtl/>
+          <w:lang w:bidi="fa-IR"/>
+        </w:rPr>
+        <w:lastRenderedPageBreak/>
+        <w:t>اصل پارتو</w:t>
+      </w:r>
+    </w:p>
+    <w:p>
+      <w:pPr>
+        <w:bidi/>
+        <w:jc w:val="left"/>
+        <w:rPr>
+          <w:rtl/>
+          <w:lang w:bidi="fa-IR"/>
+        </w:rPr>
+      </w:pPr>
+      <w:r>
+        <w:rPr>
+          <w:rFonts w:hint="cs"/>
+          <w:rtl/>
+          <w:lang w:bidi="fa-IR"/>
+        </w:rPr>
+        <w:t>در قسمت خرابی های موجود در پروژه ما بیشترین خطا ها رو در سه بخش (</w:t>
+      </w:r>
+      <w:r>
+        <w:rPr>
+          <w:rFonts w:hint="cs"/>
+          <w:rtl/>
+          <w:lang w:bidi="fa-IR"/>
+        </w:rPr>
+        <w:t>اتصال برنامه به دیتا بیس</w:t>
+      </w:r>
+      <w:r>
+        <w:rPr>
+          <w:rFonts w:hint="cs"/>
+          <w:rtl/>
+          <w:lang w:bidi="fa-IR"/>
+        </w:rPr>
+        <w:t xml:space="preserve">، </w:t>
+      </w:r>
+      <w:r>
+        <w:rPr>
+          <w:rFonts w:hint="cs"/>
+          <w:rtl/>
+          <w:lang w:bidi="fa-IR"/>
+        </w:rPr>
+        <w:t>ساخت دیتاست مورد نیاز و همچنین در اتصالا سیستم عصبی به دوربین</w:t>
+      </w:r>
+      <w:r>
+        <w:rPr>
+          <w:rFonts w:hint="cs"/>
+          <w:rtl/>
+          <w:lang w:bidi="fa-IR"/>
+        </w:rPr>
+        <w:t>) که با ریشه یابی این سه متوجه شدیم که دو دلیل اصلی برای بروز این خطا ها بود. نداشتن تجربه کافی تیم و نداشتن امکانات کافی، با رفع این دو میتوان تا حد خوبی امنیت موفقیت پروژه رو تا حد خوبی بالا برد. برای مورد اول ذکر شده تصمیم به این شد که فردی که در زمینه پروژه های دانشبنیان تجربه بالایی دارد بعنوان مشاور به تیم توسعه اضافه شود. وجود همچین فردی در تیم هم باعث سرعت گرفتن پروژه و هم کم شدن خطا ها در برنامه شود. برای مورد دوم یعنی کمبود امکانات ایده مورد بررسی استفاده از اسپانسر هست ولی برای اینکه بتوان تیم اسپانسر داشته باشد باید اول یک مدل اولیه از برنامه ساخته شود و سپس میتوان با شرکت های آسانسور سازی وارد مذاکره شد. در حال حاضر باید تا جایی که میشه از همکانات موجود استفاده کرد و از منابع رایگان استفاده کرد.</w:t>
+      </w:r>
+    </w:p>
+    <w:p>
+      <w:pPr>
+        <w:bidi/>
+        <w:jc w:val="left"/>
+        <w:rPr>
+          <w:rtl/>
+          <w:lang w:bidi="fa-IR"/>
+        </w:rPr>
+      </w:pPr>
+      <w:r>
+        <w:rPr>
+          <w:rFonts w:hint="cs"/>
+          <w:rtl/>
+          <w:lang w:bidi="fa-IR"/>
+        </w:rPr>
+        <w:t>با رفع این دو موضوع، چیزی حدود هشتاد در صد مشکلات تیم برطرف میشود.</w:t>
+      </w:r>
+    </w:p>
+    <w:p>
+      <w:pPr>
+        <w:jc w:val="left"/>
+        <w:rPr>
+          <w:rtl/>
+          <w:lang w:bidi="fa-IR"/>
+        </w:rPr>
+      </w:pPr>
+      <w:r>
+        <w:rPr>
+          <w:rtl/>
+          <w:lang w:bidi="fa-IR"/>
+        </w:rPr>
+        <w:br w:type="page"/>
+      </w:r>
+    </w:p>
+    <w:p>
+      <w:pPr>
+        <w:bidi/>
+        <w:jc w:val="left"/>
+        <w:rPr>
+          <w:rFonts w:asciiTheme="minorHAnsi" w:hAnsiTheme="minorHAnsi"/>
+          <w:rtl/>
+          <w:lang w:bidi="fa-IR"/>
+        </w:rPr>
+      </w:pPr>
+      <w:r>
+        <w:rPr>
+          <w:rFonts w:asciiTheme="minorHAnsi" w:hAnsiTheme="minorHAnsi" w:hint="cs"/>
+          <w:rtl/>
+          <w:lang w:bidi="fa-IR"/>
+        </w:rPr>
+        <w:lastRenderedPageBreak/>
+        <w:t xml:space="preserve">شمای کلی پروژه و کانتکس دیاگرام </w:t>
+      </w:r>
+    </w:p>
+    <w:p>
+      <w:pPr>
+        <w:bidi/>
+        <w:jc w:val="left"/>
+        <w:rPr>
+          <w:rFonts w:asciiTheme="minorHAnsi" w:hAnsiTheme="minorHAnsi"/>
+          <w:rtl/>
+          <w:lang w:bidi="fa-IR"/>
+        </w:rPr>
+      </w:pPr>
+      <w:r>
+        <w:rPr>
+          <w:rFonts w:asciiTheme="minorHAnsi" w:hAnsiTheme="minorHAnsi" w:hint="cs"/>
+          <w:rtl/>
+          <w:lang w:bidi="fa-IR"/>
+        </w:rPr>
+        <w:t>نمودار سطح یک پروژه:</w:t>
+      </w:r>
+    </w:p>
+    <w:p>
+      <w:pPr>
+        <w:bidi/>
+        <w:jc w:val="left"/>
+        <w:rPr>
+          <w:rFonts w:asciiTheme="minorHAnsi" w:hAnsiTheme="minorHAnsi"/>
+          <w:rtl/>
+          <w:lang w:bidi="fa-IR"/>
+        </w:rPr>
+      </w:pPr>
+      <w:r>
+        <w:rPr>
+          <w:noProof/>
+        </w:rPr>
+        <w:drawing>
+          <wp:inline distT="0" distB="0" distL="0" distR="0" wp14:anchorId="48FEBCD5" wp14:editId="63A0EBF9">
+            <wp:extent cx="5943600" cy="3568065"/>
+            <wp:effectExtent l="0" t="0" r="0" b="0"/>
+            <wp:docPr id="818377268" name="Picture 2"/>
+            <wp:cNvGraphicFramePr>
+              <a:graphicFrameLocks xmlns:a="http://schemas.openxmlformats.org/drawingml/2006/main" noChangeAspect="1"/>
+            </wp:cNvGraphicFramePr>
+            <a:graphic xmlns:a="http://schemas.openxmlformats.org/drawingml/2006/main">
+              <a:graphicData uri="http://schemas.openxmlformats.org/drawingml/2006/picture">
+                <pic:pic xmlns:pic="http://schemas.openxmlformats.org/drawingml/2006/picture">
+                  <pic:nvPicPr>
+                    <pic:cNvPr id="0" name="Picture 3"/>
+                    <pic:cNvPicPr>
+                      <a:picLocks noChangeAspect="1" noChangeArrowheads="1"/>
+                    </pic:cNvPicPr>
+                  </pic:nvPicPr>
+                  <pic:blipFill>
+                    <a:blip r:embed="rId7">
+                      <a:extLst>
+                        <a:ext uri="{28A0092B-C50C-407E-A947-70E740481C1C}">
+                          <a14:useLocalDpi xmlns:a14="http://schemas.microsoft.com/office/drawing/2010/main" val="0"/>
+                        </a:ext>
+                      </a:extLst>
+                    </a:blip>
+                    <a:srcRect/>
+                    <a:stretch>
+                      <a:fillRect/>
+                    </a:stretch>
+                  </pic:blipFill>
+                  <pic:spPr bwMode="auto">
+                    <a:xfrm>
+                      <a:off x="0" y="0"/>
+                      <a:ext cx="5943600" cy="3568065"/>
+                    </a:xfrm>
+                    <a:prstGeom prst="rect">
+                      <a:avLst/>
+                    </a:prstGeom>
+                    <a:noFill/>
+                    <a:ln>
+                      <a:noFill/>
+                    </a:ln>
+                  </pic:spPr>
+                </pic:pic>
+              </a:graphicData>
+            </a:graphic>
+          </wp:inline>
+        </w:drawing>
+      </w:r>
+      <w:r>
+        <w:rPr>
+          <w:rFonts w:asciiTheme="minorHAnsi" w:hAnsiTheme="minorHAnsi" w:hint="cs"/>
+          <w:rtl/>
+          <w:lang w:bidi="fa-IR"/>
+        </w:rPr>
+        <w:t xml:space="preserve"> </w:t>
+      </w:r>
+    </w:p>
+    <w:p>
+      <w:pPr>
+        <w:jc w:val="left"/>
+        <w:rPr>
+          <w:rFonts w:asciiTheme="minorHAnsi" w:hAnsiTheme="minorHAnsi"/>
+          <w:rtl/>
+          <w:lang w:bidi="fa-IR"/>
+        </w:rPr>
+      </w:pPr>
+      <w:r>
+        <w:rPr>
+          <w:rFonts w:asciiTheme="minorHAnsi" w:hAnsiTheme="minorHAnsi"/>
+          <w:rtl/>
+          <w:lang w:bidi="fa-IR"/>
+        </w:rPr>
+        <w:br w:type="page"/>
+      </w:r>
+    </w:p>
+    <w:p>
+      <w:pPr>
+        <w:bidi/>
+        <w:jc w:val="both"/>
+        <w:rPr>
+          <w:rFonts w:asciiTheme="minorHAnsi" w:hAnsiTheme="minorHAnsi"/>
+          <w:rtl/>
+          <w:lang w:bidi="fa-IR"/>
+        </w:rPr>
+      </w:pPr>
+      <w:r>
+        <w:rPr>
+          <w:rFonts w:hint="cs"/>
+          <w:noProof/>
+          <w:rtl/>
+        </w:rPr>
+        <w:lastRenderedPageBreak/>
+        <w:t>نمودار سطح دو برای شبکه عصبی تشخیص چهره:</w:t>
+      </w:r>
+    </w:p>
+    <w:p>
+      <w:pPr>
+        <w:bidi/>
+        <w:jc w:val="both"/>
+        <w:rPr>
+          <w:noProof/>
+          <w:rtl/>
+        </w:rPr>
+      </w:pPr>
+      <w:r>
+        <w:rPr>
+          <w:noProof/>
+        </w:rPr>
+        <w:drawing>
+          <wp:inline distT="0" distB="0" distL="0" distR="0" wp14:anchorId="07CDD069" wp14:editId="1DCA55EF">
+            <wp:extent cx="5943600" cy="3504565"/>
+            <wp:effectExtent l="0" t="0" r="0" b="635"/>
+            <wp:docPr id="1551317862" name="Picture 4"/>
+            <wp:cNvGraphicFramePr>
+              <a:graphicFrameLocks xmlns:a="http://schemas.openxmlformats.org/drawingml/2006/main" noChangeAspect="1"/>
+            </wp:cNvGraphicFramePr>
+            <a:graphic xmlns:a="http://schemas.openxmlformats.org/drawingml/2006/main">
+              <a:graphicData uri="http://schemas.openxmlformats.org/drawingml/2006/picture">
+                <pic:pic xmlns:pic="http://schemas.openxmlformats.org/drawingml/2006/picture">
+                  <pic:nvPicPr>
+                    <pic:cNvPr id="0" name="Picture 10"/>
+                    <pic:cNvPicPr>
+                      <a:picLocks noChangeAspect="1" noChangeArrowheads="1"/>
+                    </pic:cNvPicPr>
+                  </pic:nvPicPr>
+                  <pic:blipFill>
+                    <a:blip r:embed="rId8">
+                      <a:extLst>
+                        <a:ext uri="{28A0092B-C50C-407E-A947-70E740481C1C}">
+                          <a14:useLocalDpi xmlns:a14="http://schemas.microsoft.com/office/drawing/2010/main" val="0"/>
+                        </a:ext>
+                      </a:extLst>
+                    </a:blip>
+                    <a:srcRect/>
+                    <a:stretch>
+                      <a:fillRect/>
+                    </a:stretch>
+                  </pic:blipFill>
+                  <pic:spPr bwMode="auto">
+                    <a:xfrm>
+                      <a:off x="0" y="0"/>
+                      <a:ext cx="5943600" cy="3504565"/>
+                    </a:xfrm>
+                    <a:prstGeom prst="rect">
+                      <a:avLst/>
+                    </a:prstGeom>
+                    <a:noFill/>
+                    <a:ln>
+                      <a:noFill/>
+                    </a:ln>
+                  </pic:spPr>
+                </pic:pic>
+              </a:graphicData>
+            </a:graphic>
+          </wp:inline>
+        </w:drawing>
+      </w:r>
+    </w:p>
+    <w:p>
+      <w:pPr>
+        <w:bidi/>
+        <w:jc w:val="both"/>
+        <w:rPr>
+          <w:noProof/>
+          <w:rtl/>
+        </w:rPr>
+      </w:pPr>
+    </w:p>
+    <w:p>
+      <w:pPr>
+        <w:bidi/>
+        <w:jc w:val="both"/>
+        <w:rPr>
+          <w:noProof/>
+          <w:rtl/>
+        </w:rPr>
+      </w:pPr>
+      <w:r>
+        <w:rPr>
+          <w:rFonts w:hint="cs"/>
+          <w:noProof/>
+          <w:rtl/>
+        </w:rPr>
+        <w:t>نمودار سطح دو برای سیستم انتخاب طبقه آسانسور:</w:t>
+      </w:r>
+    </w:p>
+    <w:p>
+      <w:pPr>
+        <w:bidi/>
+        <w:jc w:val="both"/>
+        <w:rPr>
+          <w:noProof/>
+        </w:rPr>
+      </w:pPr>
+      <w:r>
+        <w:rPr>
+          <w:noProof/>
+        </w:rPr>
+        <w:drawing>
+          <wp:inline distT="0" distB="0" distL="0" distR="0" wp14:anchorId="3986C4DD" wp14:editId="52508F17">
+            <wp:extent cx="5943600" cy="2055495"/>
+            <wp:effectExtent l="0" t="0" r="0" b="1905"/>
+            <wp:docPr id="541299031" name="Picture 5"/>
+            <wp:cNvGraphicFramePr>
+              <a:graphicFrameLocks xmlns:a="http://schemas.openxmlformats.org/drawingml/2006/main" noChangeAspect="1"/>
+            </wp:cNvGraphicFramePr>
+            <a:graphic xmlns:a="http://schemas.openxmlformats.org/drawingml/2006/main">
+              <a:graphicData uri="http://schemas.openxmlformats.org/drawingml/2006/picture">
+                <pic:pic xmlns:pic="http://schemas.openxmlformats.org/drawingml/2006/picture">
+                  <pic:nvPicPr>
+                    <pic:cNvPr id="0" name="Picture 12"/>
+                    <pic:cNvPicPr>
+                      <a:picLocks noChangeAspect="1" noChangeArrowheads="1"/>
+                    </pic:cNvPicPr>
+                  </pic:nvPicPr>
+                  <pic:blipFill>
+                    <a:blip r:embed="rId9">
+                      <a:extLst>
+                        <a:ext uri="{28A0092B-C50C-407E-A947-70E740481C1C}">
+                          <a14:useLocalDpi xmlns:a14="http://schemas.microsoft.com/office/drawing/2010/main" val="0"/>
+                        </a:ext>
+                      </a:extLst>
+                    </a:blip>
+                    <a:srcRect/>
+                    <a:stretch>
+                      <a:fillRect/>
+                    </a:stretch>
+                  </pic:blipFill>
+                  <pic:spPr bwMode="auto">
+                    <a:xfrm>
+                      <a:off x="0" y="0"/>
+                      <a:ext cx="5943600" cy="2055495"/>
+                    </a:xfrm>
+                    <a:prstGeom prst="rect">
+                      <a:avLst/>
+                    </a:prstGeom>
+                    <a:noFill/>
+                    <a:ln>
+                      <a:noFill/>
+                    </a:ln>
+                  </pic:spPr>
+                </pic:pic>
+              </a:graphicData>
+            </a:graphic>
+          </wp:inline>
+        </w:drawing>
+      </w:r>
     </w:p>
     <w:sectPr>
       <w:pgSz w:w="12240" w:h="15840"/>
@@ -3614,6 +4069,95 @@
     </w:lvl>
   </w:abstractNum>
   <w:abstractNum w:abstractNumId="2" w15:restartNumberingAfterBreak="0">
+    <w:nsid w:val="2E6F1A64"/>
+    <w:multiLevelType w:val="hybridMultilevel"/>
+    <w:tmpl w:val="CE566352"/>
+    <w:lvl w:ilvl="0" w:tplc="210C3746">
+      <w:start w:val="1"/>
+      <w:numFmt w:val="decimalFullWidth"/>
+      <w:lvlText w:val="%1-"/>
+      <w:lvlJc w:val="left"/>
+      <w:pPr>
+        <w:ind w:left="720" w:hanging="360"/>
+      </w:pPr>
+      <w:rPr>
+        <w:rFonts w:ascii="B Nazanin" w:hAnsi="B Nazanin" w:cs="B Nazanin" w:hint="default"/>
+      </w:rPr>
+    </w:lvl>
+    <w:lvl w:ilvl="1" w:tplc="04090019" w:tentative="1">
+      <w:start w:val="1"/>
+      <w:numFmt w:val="lowerLetter"/>
+      <w:lvlText w:val="%2."/>
+      <w:lvlJc w:val="left"/>
+      <w:pPr>
+        <w:ind w:left="1440" w:hanging="360"/>
+      </w:pPr>
+    </w:lvl>
+    <w:lvl w:ilvl="2" w:tplc="0409001B" w:tentative="1">
+      <w:start w:val="1"/>
+      <w:numFmt w:val="lowerRoman"/>
+      <w:lvlText w:val="%3."/>
+      <w:lvlJc w:val="right"/>
+      <w:pPr>
+        <w:ind w:left="2160" w:hanging="180"/>
+      </w:pPr>
+    </w:lvl>
+    <w:lvl w:ilvl="3" w:tplc="0409000F" w:tentative="1">
+      <w:start w:val="1"/>
+      <w:numFmt w:val="decimal"/>
+      <w:lvlText w:val="%4."/>
+      <w:lvlJc w:val="left"/>
+      <w:pPr>
+        <w:ind w:left="2880" w:hanging="360"/>
+      </w:pPr>
+    </w:lvl>
+    <w:lvl w:ilvl="4" w:tplc="04090019" w:tentative="1">
+      <w:start w:val="1"/>
+      <w:numFmt w:val="lowerLetter"/>
+      <w:lvlText w:val="%5."/>
+      <w:lvlJc w:val="left"/>
+      <w:pPr>
+        <w:ind w:left="3600" w:hanging="360"/>
+      </w:pPr>
+    </w:lvl>
+    <w:lvl w:ilvl="5" w:tplc="0409001B" w:tentative="1">
+      <w:start w:val="1"/>
+      <w:numFmt w:val="lowerRoman"/>
+      <w:lvlText w:val="%6."/>
+      <w:lvlJc w:val="right"/>
+      <w:pPr>
+        <w:ind w:left="4320" w:hanging="180"/>
+      </w:pPr>
+    </w:lvl>
+    <w:lvl w:ilvl="6" w:tplc="0409000F" w:tentative="1">
+      <w:start w:val="1"/>
+      <w:numFmt w:val="decimal"/>
+      <w:lvlText w:val="%7."/>
+      <w:lvlJc w:val="left"/>
+      <w:pPr>
+        <w:ind w:left="5040" w:hanging="360"/>
+      </w:pPr>
+    </w:lvl>
+    <w:lvl w:ilvl="7" w:tplc="04090019" w:tentative="1">
+      <w:start w:val="1"/>
+      <w:numFmt w:val="lowerLetter"/>
+      <w:lvlText w:val="%8."/>
+      <w:lvlJc w:val="left"/>
+      <w:pPr>
+        <w:ind w:left="5760" w:hanging="360"/>
+      </w:pPr>
+    </w:lvl>
+    <w:lvl w:ilvl="8" w:tplc="0409001B" w:tentative="1">
+      <w:start w:val="1"/>
+      <w:numFmt w:val="lowerRoman"/>
+      <w:lvlText w:val="%9."/>
+      <w:lvlJc w:val="right"/>
+      <w:pPr>
+        <w:ind w:left="6480" w:hanging="180"/>
+      </w:pPr>
+    </w:lvl>
+  </w:abstractNum>
+  <w:abstractNum w:abstractNumId="3" w15:restartNumberingAfterBreak="0">
     <w:nsid w:val="2F7B4E9D"/>
     <w:multiLevelType w:val="hybridMultilevel"/>
     <w:tmpl w:val="BE00B0F2"/>
@@ -3702,7 +4246,7 @@
       </w:pPr>
     </w:lvl>
   </w:abstractNum>
-  <w:abstractNum w:abstractNumId="3" w15:restartNumberingAfterBreak="0">
+  <w:abstractNum w:abstractNumId="4" w15:restartNumberingAfterBreak="0">
     <w:nsid w:val="66D430C2"/>
     <w:multiLevelType w:val="hybridMultilevel"/>
     <w:tmpl w:val="A2BED1E4"/>
@@ -3791,7 +4335,7 @@
       </w:pPr>
     </w:lvl>
   </w:abstractNum>
-  <w:abstractNum w:abstractNumId="4" w15:restartNumberingAfterBreak="0">
+  <w:abstractNum w:abstractNumId="5" w15:restartNumberingAfterBreak="0">
     <w:nsid w:val="79882C5E"/>
     <w:multiLevelType w:val="hybridMultilevel"/>
     <w:tmpl w:val="C4BAAEDA"/>
@@ -3881,19 +4425,22 @@
     </w:lvl>
   </w:abstractNum>
   <w:num w:numId="1" w16cid:durableId="1117412368">
-    <w:abstractNumId w:val="4"/>
+    <w:abstractNumId w:val="5"/>
   </w:num>
   <w:num w:numId="2" w16cid:durableId="53742103">
-    <w:abstractNumId w:val="3"/>
+    <w:abstractNumId w:val="4"/>
   </w:num>
   <w:num w:numId="3" w16cid:durableId="1354527021">
     <w:abstractNumId w:val="1"/>
   </w:num>
   <w:num w:numId="4" w16cid:durableId="1913853104">
-    <w:abstractNumId w:val="2"/>
+    <w:abstractNumId w:val="3"/>
   </w:num>
   <w:num w:numId="5" w16cid:durableId="539511510">
     <w:abstractNumId w:val="0"/>
+  </w:num>
+  <w:num w:numId="6" w16cid:durableId="1798572833">
+    <w:abstractNumId w:val="2"/>
   </w:num>
 </w:numbering>
 </file>
@@ -4360,6 +4907,7 @@
   <w:style w:type="character" w:default="1" w:styleId="DefaultParagraphFont">
     <w:name w:val="Default Paragraph Font"/>
     <w:uiPriority w:val="1"/>
+    <w:semiHidden/>
     <w:unhideWhenUsed/>
   </w:style>
   <w:style w:type="table" w:default="1" w:styleId="TableNormal">
@@ -4737,4 +5285,16 @@
     </a:ext>
   </a:extLst>
 </a:theme>
+</file>
+
+<file path=customXml/item1.xml><?xml version="1.0" encoding="utf-8"?>
+<b:Sources xmlns:b="http://schemas.openxmlformats.org/officeDocument/2006/bibliography" xmlns="http://schemas.openxmlformats.org/officeDocument/2006/bibliography" SelectedStyle="\APASixthEditionOfficeOnline.xsl" StyleName="APA" Version="6"/>
+</file>
+
+<file path=customXml/itemProps1.xml><?xml version="1.0" encoding="utf-8"?>
+<ds:datastoreItem xmlns:ds="http://schemas.openxmlformats.org/officeDocument/2006/customXml" ds:itemID="{957D97CB-263C-40DA-B838-653E14B3C15A}">
+  <ds:schemaRefs>
+    <ds:schemaRef ds:uri="http://schemas.openxmlformats.org/officeDocument/2006/bibliography"/>
+  </ds:schemaRefs>
+</ds:datastoreItem>
 </file>
</xml_diff>